<commit_message>
Stagger Figure 2B's null labels so they no longer overlap
The author found "p95 0.0087" and "max of 1,000 0.0137" drawn over each other on page 14 of the
rendered PDF. They sat on one baseline under markers 0.005 apart; a narrow width estimate puts the
overlap at 21.7 px, and no other label pair in the three figures overlaps.

The max label now sits one line lower, still under its own marker, with the caption lines and the
figure height moved down 12 px to make room. Figures 1 and 3 regenerate byte-identical; Figure 2
changes in five lines, with every string and number unchanged.

The figure builder is in the evidence inventory and the figures in the package lock, so the locks
were cascaded and the final render regenerated. The Phase 3j bundle, cut from e9f6184 and never
uploaded, is superseded; the bundle is rebuilt from this commit.

Co-Authored-By: Claude Opus 5 <noreply@anthropic.com>
</commit_message>
<xml_diff>
--- a/results/manuscript/submission/MANUSCRIPT_BMC.docx
+++ b/results/manuscript/submission/MANUSCRIPT_BMC.docx
@@ -96,16 +96,16 @@
         <w:rPr>
           <w:rStyle w:val="VerbatimChar"/>
         </w:rPr>
-        <w:t xml:space="preserve">  evidence lock   dd655cc7656b286f3a2d71ac3680264d31bfa2b4a1865b3864e300795fb824be</w:t>
-      </w:r>
-      <w:r>
-        <w:br/>
-      </w:r>
-      <w:r>
-        <w:rPr>
-          <w:rStyle w:val="VerbatimChar"/>
-        </w:rPr>
-        <w:t xml:space="preserve">  claim lock      a748a55e540a4652e00af27ec93acc601ae0b88b630cee0bdc0f43ea953b25af</w:t>
+        <w:t xml:space="preserve">  evidence lock   60602531449079b8f86debea9ffd69753f8bfad033be4c476751d39da08c78aa</w:t>
+      </w:r>
+      <w:r>
+        <w:br/>
+      </w:r>
+      <w:r>
+        <w:rPr>
+          <w:rStyle w:val="VerbatimChar"/>
+        </w:rPr>
+        <w:t xml:space="preserve">  claim lock      fc6dc2f221acf1c7661e36071b9e377571c8f903d38398b55bedc164db7efa61</w:t>
       </w:r>
     </w:p>
     <w:p>
@@ -3320,16 +3320,16 @@
         <w:rPr>
           <w:rStyle w:val="VerbatimChar"/>
         </w:rPr>
-        <w:t xml:space="preserve">  evidence lock digest   dd655cc7656b286f3a2d71ac3680264d31bfa2b4a1865b3864e300795fb824be</w:t>
-      </w:r>
-      <w:r>
-        <w:br/>
-      </w:r>
-      <w:r>
-        <w:rPr>
-          <w:rStyle w:val="VerbatimChar"/>
-        </w:rPr>
-        <w:t xml:space="preserve">  claim lock digest      a748a55e540a4652e00af27ec93acc601ae0b88b630cee0bdc0f43ea953b25af</w:t>
+        <w:t xml:space="preserve">  evidence lock digest   60602531449079b8f86debea9ffd69753f8bfad033be4c476751d39da08c78aa</w:t>
+      </w:r>
+      <w:r>
+        <w:br/>
+      </w:r>
+      <w:r>
+        <w:rPr>
+          <w:rStyle w:val="VerbatimChar"/>
+        </w:rPr>
+        <w:t xml:space="preserve">  claim lock digest      fc6dc2f221acf1c7661e36071b9e377571c8f903d38398b55bedc164db7efa61</w:t>
       </w:r>
     </w:p>
     <w:bookmarkEnd w:id="36"/>

</xml_diff>

<commit_message>
Bump the archive to gen1-v1.0.1, and cascade the digests
The new archive version was going to ship with CITATION.cff still reading
gen1-v1.0.0, so anyone citing what the archive says about itself would cite
the wrong version, and reference [12] of the manuscript inside it named the
archive as version 1.0.0 accessed 16 Sep.

Bumped CITATION.cff, .zenodo.json and reference [12], then cascaded. Only
CITATION.cff is inside the evidence lock, so all three digests moved:

  evidence   60602531 -> 93c24611
  claim      fc6dc2f2 -> 116b628a
  package    52a538d4 -> 2771b565

The evidence digest was predicted before running the cascade, by recomputing
the lock with CITATION.cff's hash replaced, and the cascade confirmed it.

Locks clean, 39 manuscript tests pass, all seven submission outputs re-rendered
and checked: the rendered docx carries both new digests, no trace of the
superseded one, and the PolyForm licence version is untouched.

Co-Authored-By: Claude Opus 5 <noreply@anthropic.com>
</commit_message>
<xml_diff>
--- a/results/manuscript/submission/MANUSCRIPT_BMC.docx
+++ b/results/manuscript/submission/MANUSCRIPT_BMC.docx
@@ -96,7 +96,7 @@
         <w:rPr>
           <w:rStyle w:val="VerbatimChar"/>
         </w:rPr>
-        <w:t xml:space="preserve">  evidence lock   60602531449079b8f86debea9ffd69753f8bfad033be4c476751d39da08c78aa</w:t>
+        <w:t xml:space="preserve">  evidence lock   93c24611898c4d265573b7c4e39d4cb6cc4ba78a0ae54139e24d87fcebe70304</w:t>
       </w:r>
       <w:r>
         <w:br/>
@@ -105,7 +105,7 @@
         <w:rPr>
           <w:rStyle w:val="VerbatimChar"/>
         </w:rPr>
-        <w:t xml:space="preserve">  claim lock      fc6dc2f221acf1c7661e36071b9e377571c8f903d38398b55bedc164db7efa61</w:t>
+        <w:t xml:space="preserve">  claim lock      116b628a5e1846ebfe630ab42d8769b3a8420744bc0b15521567954de1d6175c</w:t>
       </w:r>
     </w:p>
     <w:p>
@@ -4291,7 +4291,7 @@
         <w:rPr>
           <w:rStyle w:val="VerbatimChar"/>
         </w:rPr>
-        <w:t xml:space="preserve">  evidence lock digest   60602531449079b8f86debea9ffd69753f8bfad033be4c476751d39da08c78aa</w:t>
+        <w:t xml:space="preserve">  evidence lock digest   93c24611898c4d265573b7c4e39d4cb6cc4ba78a0ae54139e24d87fcebe70304</w:t>
       </w:r>
       <w:r>
         <w:br/>
@@ -4300,7 +4300,7 @@
         <w:rPr>
           <w:rStyle w:val="VerbatimChar"/>
         </w:rPr>
-        <w:t xml:space="preserve">  claim lock digest      fc6dc2f221acf1c7661e36071b9e377571c8f903d38398b55bedc164db7efa61</w:t>
+        <w:t xml:space="preserve">  claim lock digest      116b628a5e1846ebfe630ab42d8769b3a8420744bc0b15521567954de1d6175c</w:t>
       </w:r>
     </w:p>
     <w:bookmarkEnd w:id="35"/>
@@ -5045,7 +5045,7 @@
         <w:t xml:space="preserve"> </w:t>
       </w:r>
       <w:r>
-        <w:t xml:space="preserve">CellFate-Rx Gen-1: frozen model and reproducibility artifacts, version 1.0.0 [software].</w:t>
+        <w:t xml:space="preserve">CellFate-Rx Gen-1: frozen model and reproducibility artifacts, version 1.0.1 [software].</w:t>
       </w:r>
       <w:r>
         <w:t xml:space="preserve"> </w:t>
@@ -5057,7 +5057,7 @@
         <w:t xml:space="preserve"> </w:t>
       </w:r>
       <w:r>
-        <w:t xml:space="preserve">https://doi.org/10.5281/zenodo.22769563 Accessed 16 Sep 2026.</w:t>
+        <w:t xml:space="preserve">https://doi.org/10.5281/zenodo.22769563 Accessed 19 Sep 2026.</w:t>
       </w:r>
     </w:p>
     <w:p>

</xml_diff>

<commit_message>
Cite the archive by its concept DOI, not its 1.0.0 version DOI
10.5281/zenodo.22769563 is the version DOI of gen1-v1.0.0, not the concept
DOI; Zenodo's API gives the concept DOI as 10.5281/zenodo.22769562. Before
yesterday's bump, reference [12] read "version 1.0.0" beside the version DOI
and was correct. The bump moved the version string and left the DOI, so the
reference named 1.0.1 and linked the 1.0.0 snapshot.

Moved to the concept DOI, which resolves to the newest version and is known
before publishing, so CITATION.cff no longer has to be edited per release.
The comment at the top of CITATION.cff mandated the opposite and is rewritten.

  evidence   93c24611 -> 4581fce5
  claim      116b628a -> fcd25d3e
  package    2771b565 -> 68bc4015

Locks clean, 39 tests pass, all seven submission outputs re-rendered. The
rendered docx carries the concept DOI, both new digests, and no trace of
22769563 or the superseded digest.

Co-Authored-By: Claude Opus 5 <noreply@anthropic.com>
</commit_message>
<xml_diff>
--- a/results/manuscript/submission/MANUSCRIPT_BMC.docx
+++ b/results/manuscript/submission/MANUSCRIPT_BMC.docx
@@ -96,7 +96,7 @@
         <w:rPr>
           <w:rStyle w:val="VerbatimChar"/>
         </w:rPr>
-        <w:t xml:space="preserve">  evidence lock   93c24611898c4d265573b7c4e39d4cb6cc4ba78a0ae54139e24d87fcebe70304</w:t>
+        <w:t xml:space="preserve">  evidence lock   4581fce568a8733d53f2e9c5e011b0c2cafc8e0aff5a2b65487b8055eff3a3c2</w:t>
       </w:r>
       <w:r>
         <w:br/>
@@ -105,7 +105,7 @@
         <w:rPr>
           <w:rStyle w:val="VerbatimChar"/>
         </w:rPr>
-        <w:t xml:space="preserve">  claim lock      116b628a5e1846ebfe630ab42d8769b3a8420744bc0b15521567954de1d6175c</w:t>
+        <w:t xml:space="preserve">  claim lock      fcd25d3eb37aa9e4b4c973975a54565db0c49dfb60b7cdfea9be6821b4d051de</w:t>
       </w:r>
     </w:p>
     <w:p>
@@ -4291,7 +4291,7 @@
         <w:rPr>
           <w:rStyle w:val="VerbatimChar"/>
         </w:rPr>
-        <w:t xml:space="preserve">  evidence lock digest   93c24611898c4d265573b7c4e39d4cb6cc4ba78a0ae54139e24d87fcebe70304</w:t>
+        <w:t xml:space="preserve">  evidence lock digest   4581fce568a8733d53f2e9c5e011b0c2cafc8e0aff5a2b65487b8055eff3a3c2</w:t>
       </w:r>
       <w:r>
         <w:br/>
@@ -4300,7 +4300,7 @@
         <w:rPr>
           <w:rStyle w:val="VerbatimChar"/>
         </w:rPr>
-        <w:t xml:space="preserve">  claim lock digest      116b628a5e1846ebfe630ab42d8769b3a8420744bc0b15521567954de1d6175c</w:t>
+        <w:t xml:space="preserve">  claim lock digest      fcd25d3eb37aa9e4b4c973975a54565db0c49dfb60b7cdfea9be6821b4d051de</w:t>
       </w:r>
     </w:p>
     <w:bookmarkEnd w:id="35"/>
@@ -5051,13 +5051,13 @@
         <w:t xml:space="preserve"> </w:t>
       </w:r>
       <w:r>
-        <w:t xml:space="preserve">Zenodo. 2026. doi:10.5281/zenodo.22769563</w:t>
-      </w:r>
-      <w:r>
-        <w:t xml:space="preserve"> </w:t>
-      </w:r>
-      <w:r>
-        <w:t xml:space="preserve">https://doi.org/10.5281/zenodo.22769563 Accessed 19 Sep 2026.</w:t>
+        <w:t xml:space="preserve">Zenodo. 2026. doi:10.5281/zenodo.22769562</w:t>
+      </w:r>
+      <w:r>
+        <w:t xml:space="preserve"> </w:t>
+      </w:r>
+      <w:r>
+        <w:t xml:space="preserve">https://doi.org/10.5281/zenodo.22769562 Accessed 19 Sep 2026.</w:t>
       </w:r>
     </w:p>
     <w:p>
@@ -5080,7 +5080,7 @@
         <w:t xml:space="preserve"> </w:t>
       </w:r>
       <w:r>
-        <w:t xml:space="preserve">GitHub. 2026. Archived at doi:10.5281/zenodo.22769563</w:t>
+        <w:t xml:space="preserve">GitHub. 2026. Archived at doi:10.5281/zenodo.22769562</w:t>
       </w:r>
       <w:r>
         <w:t xml:space="preserve"> </w:t>

</xml_diff>

<commit_message>
Bump the archive to gen1-v1.0.2, and unpin the preprint version
Two deposits with different contents must not share a version label, so the
corrected archive becomes 1.0.2 rather than a second deposit of 1.0.1.

CITATION.cff carries the version and sits inside the evidence lock, so the
evidence and claim digests move with it, the manuscript title page prints both,
and the preprint therefore needs a new version too. No science moved; the
version label simply lives inside the hashed set.

The cover letter no longer names a specific preprint version DOI. Naming one is
why it needed updating on every republish; it now names the concept DOI alone,
which resolves to the newest version.

Digests read from the lock files after the cascade and compared against the
rendered docx, rather than carried forward. All three verifies INTACT, full
suite green.

Co-Authored-By: Claude Opus 5 <noreply@anthropic.com>
</commit_message>
<xml_diff>
--- a/results/manuscript/submission/MANUSCRIPT_BMC.docx
+++ b/results/manuscript/submission/MANUSCRIPT_BMC.docx
@@ -96,7 +96,7 @@
         <w:rPr>
           <w:rStyle w:val="VerbatimChar"/>
         </w:rPr>
-        <w:t xml:space="preserve">  evidence lock   4581fce568a8733d53f2e9c5e011b0c2cafc8e0aff5a2b65487b8055eff3a3c2</w:t>
+        <w:t xml:space="preserve">  evidence lock   924202ce1ceecad95365d584e6aac5f7419ae0bea0e65a3c322e44be7dee254a</w:t>
       </w:r>
       <w:r>
         <w:br/>
@@ -105,7 +105,7 @@
         <w:rPr>
           <w:rStyle w:val="VerbatimChar"/>
         </w:rPr>
-        <w:t xml:space="preserve">  claim lock      fcd25d3eb37aa9e4b4c973975a54565db0c49dfb60b7cdfea9be6821b4d051de</w:t>
+        <w:t xml:space="preserve">  claim lock      87ce74beba6f80a6dde2c44d6ca3cee6ec79bebe35ac24da438c6ce34acfb199</w:t>
       </w:r>
     </w:p>
     <w:p>
@@ -4291,7 +4291,7 @@
         <w:rPr>
           <w:rStyle w:val="VerbatimChar"/>
         </w:rPr>
-        <w:t xml:space="preserve">  evidence lock digest   4581fce568a8733d53f2e9c5e011b0c2cafc8e0aff5a2b65487b8055eff3a3c2</w:t>
+        <w:t xml:space="preserve">  evidence lock digest   924202ce1ceecad95365d584e6aac5f7419ae0bea0e65a3c322e44be7dee254a</w:t>
       </w:r>
       <w:r>
         <w:br/>
@@ -4300,7 +4300,7 @@
         <w:rPr>
           <w:rStyle w:val="VerbatimChar"/>
         </w:rPr>
-        <w:t xml:space="preserve">  claim lock digest      fcd25d3eb37aa9e4b4c973975a54565db0c49dfb60b7cdfea9be6821b4d051de</w:t>
+        <w:t xml:space="preserve">  claim lock digest      87ce74beba6f80a6dde2c44d6ca3cee6ec79bebe35ac24da438c6ce34acfb199</w:t>
       </w:r>
     </w:p>
     <w:bookmarkEnd w:id="35"/>
@@ -5045,7 +5045,7 @@
         <w:t xml:space="preserve"> </w:t>
       </w:r>
       <w:r>
-        <w:t xml:space="preserve">CellFate-Rx Gen-1: frozen model and reproducibility artifacts, version 1.0.1 [software].</w:t>
+        <w:t xml:space="preserve">CellFate-Rx Gen-1: frozen model and reproducibility artifacts, version 1.0.2 [software].</w:t>
       </w:r>
       <w:r>
         <w:t xml:space="preserve"> </w:t>
@@ -5057,7 +5057,7 @@
         <w:t xml:space="preserve"> </w:t>
       </w:r>
       <w:r>
-        <w:t xml:space="preserve">https://doi.org/10.5281/zenodo.22769562 Accessed 19 Sep 2026.</w:t>
+        <w:t xml:space="preserve">https://doi.org/10.5281/zenodo.22769562 Accessed 20 Sep 2026.</w:t>
       </w:r>
     </w:p>
     <w:p>
@@ -5086,7 +5086,7 @@
         <w:t xml:space="preserve"> </w:t>
       </w:r>
       <w:r>
-        <w:t xml:space="preserve">https://github.com/hagai-tyty/Cellular-Outcomes-of-Perturbations Accessed 18 Sep 2026.</w:t>
+        <w:t xml:space="preserve">https://github.com/hagai-tyty/Cellular-Outcomes-of-Perturbations Accessed 20 Sep 2026.</w:t>
       </w:r>
     </w:p>
     <w:p>

</xml_diff>

<commit_message>
Cite every table and reference in the body, as BMC's technical check asks
BMC returned v1.0: Tables 2-5 had no in-text citation, and references 7, 8, 9,
11, 12 and 13 were cited only under "Availability of data and materials" --
which the published article replaces with the form's statement, so they would
have been cited nowhere. Table 1 and reference 10 had the identical problem
and were fixed too.

A pointer sentence now precedes each table, and the Methods Data section cites
references 7-13 in order after [6]. Compared paragraph by paragraph with the
file BMC holds: 227 of 228 identical, one changed, five added, figures and
title-page digests unchanged.

New tests/test_manuscript_citations.py guards all three properties. It fails
on the returned file naming exactly BMC's points plus the two it missed, and
its ordering check fails on a planted out-of-order citation.

Co-Authored-By: Claude Opus 5.5 <noreply@anthropic.com>
</commit_message>
<xml_diff>
--- a/results/manuscript/submission/MANUSCRIPT_BMC.docx
+++ b/results/manuscript/submission/MANUSCRIPT_BMC.docx
@@ -1024,7 +1024,37 @@
         <w:t xml:space="preserve"> </w:t>
       </w:r>
       <w:r>
-        <w:t xml:space="preserve">vendored; accessions are given above.</w:t>
+        <w:t xml:space="preserve">vendored. Role B’s data are in GEO under GSE279162 [7], and the original authors’ analysis code,</w:t>
+      </w:r>
+      <w:r>
+        <w:t xml:space="preserve"> </w:t>
+      </w:r>
+      <w:r>
+        <w:t xml:space="preserve">read to reconstruct their preprocessing rules, is archived at Zenodo [8]. For Role A, three</w:t>
+      </w:r>
+      <w:r>
+        <w:t xml:space="preserve"> </w:t>
+      </w:r>
+      <w:r>
+        <w:t xml:space="preserve">processed barcode tables that are not part of its GEO deposit were taken from the original authors’</w:t>
+      </w:r>
+      <w:r>
+        <w:t xml:space="preserve"> </w:t>
+      </w:r>
+      <w:r>
+        <w:t xml:space="preserve">shared data package [9], linked from the key resources table of Jain et al. [10]; their scripts are</w:t>
+      </w:r>
+      <w:r>
+        <w:t xml:space="preserve"> </w:t>
+      </w:r>
+      <w:r>
+        <w:t xml:space="preserve">archived at Zenodo [11]. The code, protocols and records of this study are archived at Zenodo [12]</w:t>
+      </w:r>
+      <w:r>
+        <w:t xml:space="preserve"> </w:t>
+      </w:r>
+      <w:r>
+        <w:t xml:space="preserve">and developed on GitHub [13].</w:t>
       </w:r>
       <w:r>
         <w:t xml:space="preserve"> </w:t>
@@ -1040,13 +1070,7 @@
         <w:t xml:space="preserve"> </w:t>
       </w:r>
       <w:r>
-        <w:t xml:space="preserve">summarises the design and the evaluable</w:t>
-      </w:r>
-      <w:r>
-        <w:t xml:space="preserve"> </w:t>
-      </w:r>
-      <w:r>
-        <w:t xml:space="preserve">population.</w:t>
+        <w:t xml:space="preserve">summarises the design and the evaluable population.</w:t>
       </w:r>
     </w:p>
     <w:bookmarkEnd w:id="14"/>
@@ -1176,6 +1200,27 @@
     <w:p>
       <w:pPr>
         <w:pStyle w:val="FirstParagraph"/>
+      </w:pPr>
+      <w:r>
+        <w:t xml:space="preserve">The three preregistered models are specified in</w:t>
+      </w:r>
+      <w:r>
+        <w:t xml:space="preserve"> </w:t>
+      </w:r>
+      <w:r>
+        <w:rPr>
+          <w:b/>
+          <w:bCs/>
+        </w:rPr>
+        <w:t xml:space="preserve">Table 1</w:t>
+      </w:r>
+      <w:r>
+        <w:t xml:space="preserve">.</w:t>
+      </w:r>
+    </w:p>
+    <w:p>
+      <w:pPr>
+        <w:pStyle w:val="BodyText"/>
       </w:pPr>
       <w:r>
         <w:rPr>
@@ -1710,6 +1755,27 @@
     <w:p>
       <w:pPr>
         <w:pStyle w:val="FirstParagraph"/>
+      </w:pPr>
+      <w:r>
+        <w:t xml:space="preserve">The ranking score of each model and the preregistered difference are given in</w:t>
+      </w:r>
+      <w:r>
+        <w:t xml:space="preserve"> </w:t>
+      </w:r>
+      <w:r>
+        <w:rPr>
+          <w:b/>
+          <w:bCs/>
+        </w:rPr>
+        <w:t xml:space="preserve">Table 2</w:t>
+      </w:r>
+      <w:r>
+        <w:t xml:space="preserve">.</w:t>
+      </w:r>
+    </w:p>
+    <w:p>
+      <w:pPr>
+        <w:pStyle w:val="BodyText"/>
       </w:pPr>
       <w:r>
         <w:rPr>
@@ -2114,6 +2180,27 @@
         <w:pStyle w:val="FirstParagraph"/>
       </w:pPr>
       <w:r>
+        <w:t xml:space="preserve">The observed statistic is set against its permutation null in</w:t>
+      </w:r>
+      <w:r>
+        <w:t xml:space="preserve"> </w:t>
+      </w:r>
+      <w:r>
+        <w:rPr>
+          <w:b/>
+          <w:bCs/>
+        </w:rPr>
+        <w:t xml:space="preserve">Table 3</w:t>
+      </w:r>
+      <w:r>
+        <w:t xml:space="preserve">.</w:t>
+      </w:r>
+    </w:p>
+    <w:p>
+      <w:pPr>
+        <w:pStyle w:val="BodyText"/>
+      </w:pPr>
+      <w:r>
         <w:rPr>
           <w:b/>
           <w:bCs/>
@@ -2322,6 +2409,33 @@
     <w:p>
       <w:pPr>
         <w:pStyle w:val="FirstParagraph"/>
+      </w:pPr>
+      <w:r>
+        <w:t xml:space="preserve">The preregistered difference within each stratum, by outer fold and by pretreatment depth, is given</w:t>
+      </w:r>
+      <w:r>
+        <w:t xml:space="preserve"> </w:t>
+      </w:r>
+      <w:r>
+        <w:t xml:space="preserve">in</w:t>
+      </w:r>
+      <w:r>
+        <w:t xml:space="preserve"> </w:t>
+      </w:r>
+      <w:r>
+        <w:rPr>
+          <w:b/>
+          <w:bCs/>
+        </w:rPr>
+        <w:t xml:space="preserve">Table 4</w:t>
+      </w:r>
+      <w:r>
+        <w:t xml:space="preserve">.</w:t>
+      </w:r>
+    </w:p>
+    <w:p>
+      <w:pPr>
+        <w:pStyle w:val="BodyText"/>
       </w:pPr>
       <w:r>
         <w:rPr>
@@ -2678,6 +2792,27 @@
     <w:p>
       <w:pPr>
         <w:pStyle w:val="FirstParagraph"/>
+      </w:pPr>
+      <w:r>
+        <w:t xml:space="preserve">The top-choice diagnostic is given in</w:t>
+      </w:r>
+      <w:r>
+        <w:t xml:space="preserve"> </w:t>
+      </w:r>
+      <w:r>
+        <w:rPr>
+          <w:b/>
+          <w:bCs/>
+        </w:rPr>
+        <w:t xml:space="preserve">Table 5</w:t>
+      </w:r>
+      <w:r>
+        <w:t xml:space="preserve">.</w:t>
+      </w:r>
+    </w:p>
+    <w:p>
+      <w:pPr>
+        <w:pStyle w:val="BodyText"/>
       </w:pPr>
       <w:r>
         <w:rPr>

</xml_diff>